<commit_message>
SD interaction working. created customizable root directory
</commit_message>
<xml_diff>
--- a/documentation/Teensy4_setup.docx
+++ b/documentation/Teensy4_setup.docx
@@ -6,13 +6,8 @@
       <w:pPr>
         <w:pStyle w:val="Titel"/>
       </w:pPr>
-      <w:proofErr w:type="spellStart"/>
-      <w:r>
-        <w:t>Teensy</w:t>
-      </w:r>
-      <w:proofErr w:type="spellEnd"/>
-      <w:r>
-        <w:t xml:space="preserve"> 4.0 Setup</w:t>
+      <w:r>
+        <w:t>Teensy 4.0 Setup</w:t>
       </w:r>
     </w:p>
     <w:p/>
@@ -40,46 +35,12 @@
         </w:rPr>
       </w:pPr>
       <w:hyperlink r:id="rId5" w:history="1">
-        <w:proofErr w:type="spellStart"/>
-        <w:proofErr w:type="gramStart"/>
         <w:r>
           <w:rPr>
             <w:rStyle w:val="Hyperlink"/>
             <w:lang w:val="fr-CH"/>
           </w:rPr>
-          <w:t>Teensyduino</w:t>
-        </w:r>
-        <w:proofErr w:type="spellEnd"/>
-        <w:r>
-          <w:rPr>
-            <w:rStyle w:val="Hyperlink"/>
-            <w:lang w:val="fr-CH"/>
-          </w:rPr>
-          <w:t>:</w:t>
-        </w:r>
-        <w:proofErr w:type="gramEnd"/>
-        <w:r>
-          <w:rPr>
-            <w:rStyle w:val="Hyperlink"/>
-            <w:lang w:val="fr-CH"/>
-          </w:rPr>
-          <w:t xml:space="preserve"> </w:t>
-        </w:r>
-        <w:proofErr w:type="spellStart"/>
-        <w:r>
-          <w:rPr>
-            <w:rStyle w:val="Hyperlink"/>
-            <w:lang w:val="fr-CH"/>
-          </w:rPr>
-          <w:t>Teensy</w:t>
-        </w:r>
-        <w:proofErr w:type="spellEnd"/>
-        <w:r>
-          <w:rPr>
-            <w:rStyle w:val="Hyperlink"/>
-            <w:lang w:val="fr-CH"/>
-          </w:rPr>
-          <w:t xml:space="preserve"> support for Arduino IDE</w:t>
+          <w:t>Teensyduino: Teensy support for Arduino IDE</w:t>
         </w:r>
       </w:hyperlink>
     </w:p>
@@ -109,13 +70,8 @@
           <w:lang w:val="fr-CH"/>
         </w:rPr>
       </w:pPr>
-      <w:proofErr w:type="spellStart"/>
-      <w:r>
-        <w:t>Teensy</w:t>
-      </w:r>
-      <w:proofErr w:type="spellEnd"/>
-      <w:r>
-        <w:t xml:space="preserve"> Boards</w:t>
+      <w:r>
+        <w:t>Teensy Boards</w:t>
       </w:r>
     </w:p>
     <w:p>
@@ -132,10 +88,187 @@
       <w:r>
         <w:t>Teensyduino</w:t>
       </w:r>
-      <w:r>
-        <w:rPr>
-          <w:lang w:val="fr-CH"/>
-        </w:rPr>
+    </w:p>
+    <w:p>
+      <w:pPr>
+        <w:pStyle w:val="Listenabsatz"/>
+        <w:numPr>
+          <w:ilvl w:val="0"/>
+          <w:numId w:val="1"/>
+        </w:numPr>
+      </w:pPr>
+      <w:hyperlink r:id="rId6" w:history="1">
+        <w:r>
+          <w:rPr>
+            <w:rStyle w:val="Hyperlink"/>
+          </w:rPr>
+          <w:t>Getting started with Teensy USB development board</w:t>
+        </w:r>
+      </w:hyperlink>
+    </w:p>
+    <w:p/>
+    <w:p/>
+    <w:p>
+      <w:pPr>
+        <w:pStyle w:val="berschrift1"/>
+      </w:pPr>
+      <w:r>
+        <w:t>Solder</w:t>
+      </w:r>
+    </w:p>
+    <w:p>
+      <w:pPr>
+        <w:pStyle w:val="Listenabsatz"/>
+        <w:numPr>
+          <w:ilvl w:val="0"/>
+          <w:numId w:val="2"/>
+        </w:numPr>
+      </w:pPr>
+      <w:r>
+        <w:t>Solder Pin Headers to Teensy</w:t>
+      </w:r>
+    </w:p>
+    <w:p>
+      <w:pPr>
+        <w:pStyle w:val="Listenabsatz"/>
+        <w:numPr>
+          <w:ilvl w:val="0"/>
+          <w:numId w:val="2"/>
+        </w:numPr>
+      </w:pPr>
+      <w:r>
+        <w:t>Solder Socket Headers to Audio Board. Shorten with Metal Saw if needed</w:t>
+      </w:r>
+    </w:p>
+    <w:p>
+      <w:pPr>
+        <w:pStyle w:val="Listenabsatz"/>
+        <w:numPr>
+          <w:ilvl w:val="0"/>
+          <w:numId w:val="2"/>
+        </w:numPr>
+      </w:pPr>
+      <w:r>
+        <w:t>Put 3 Pin headers into «Line In» G, R and L Pins</w:t>
+      </w:r>
+    </w:p>
+    <w:p>
+      <w:pPr>
+        <w:pStyle w:val="Listenabsatz"/>
+        <w:numPr>
+          <w:ilvl w:val="0"/>
+          <w:numId w:val="2"/>
+        </w:numPr>
+      </w:pPr>
+      <w:r>
+        <w:t xml:space="preserve">Solder Cables to Pin 16 </w:t>
+      </w:r>
+      <w:r>
+        <w:t xml:space="preserve">(BTN) </w:t>
+      </w:r>
+      <w:r>
+        <w:t xml:space="preserve">and 14 </w:t>
+      </w:r>
+      <w:r>
+        <w:t>(</w:t>
+      </w:r>
+      <w:r>
+        <w:t>LED</w:t>
+      </w:r>
+      <w:r>
+        <w:t>)</w:t>
+      </w:r>
+    </w:p>
+    <w:p>
+      <w:pPr>
+        <w:pStyle w:val="Listenabsatz"/>
+        <w:numPr>
+          <w:ilvl w:val="0"/>
+          <w:numId w:val="2"/>
+        </w:numPr>
+      </w:pPr>
+      <w:r>
+        <w:t>Solder 5 free cable ends to Jack connector, Button and LED</w:t>
+      </w:r>
+      <w:r>
+        <w:br/>
+        <w:t>Lin</w:t>
+      </w:r>
+      <w:r>
+        <w:t>(5)</w:t>
+      </w:r>
+      <w:r>
+        <w:t>, GND</w:t>
+      </w:r>
+      <w:r>
+        <w:t xml:space="preserve"> (1)</w:t>
+      </w:r>
+      <w:r>
+        <w:t>, Rin</w:t>
+      </w:r>
+      <w:r>
+        <w:t>(2)</w:t>
+      </w:r>
+      <w:r>
+        <w:t>, BTN, LED</w:t>
+      </w:r>
+      <w:r>
+        <w:br/>
+      </w:r>
+      <w:r>
+        <w:drawing>
+          <wp:inline distT="0" distB="0" distL="0" distR="0" wp14:anchorId="1F37C76B" wp14:editId="5B18C031">
+            <wp:extent cx="2430994" cy="1959428"/>
+            <wp:effectExtent l="0" t="0" r="7620" b="3175"/>
+            <wp:docPr id="1" name="Grafik 1"/>
+            <wp:cNvGraphicFramePr>
+              <a:graphicFrameLocks xmlns:a="http://schemas.openxmlformats.org/drawingml/2006/main" noChangeAspect="1"/>
+            </wp:cNvGraphicFramePr>
+            <a:graphic xmlns:a="http://schemas.openxmlformats.org/drawingml/2006/main">
+              <a:graphicData uri="http://schemas.openxmlformats.org/drawingml/2006/picture">
+                <pic:pic xmlns:pic="http://schemas.openxmlformats.org/drawingml/2006/picture">
+                  <pic:nvPicPr>
+                    <pic:cNvPr id="1" name=""/>
+                    <pic:cNvPicPr/>
+                  </pic:nvPicPr>
+                  <pic:blipFill rotWithShape="1">
+                    <a:blip r:embed="rId7"/>
+                    <a:srcRect b="1199"/>
+                    <a:stretch/>
+                  </pic:blipFill>
+                  <pic:spPr bwMode="auto">
+                    <a:xfrm>
+                      <a:off x="0" y="0"/>
+                      <a:ext cx="2445338" cy="1970990"/>
+                    </a:xfrm>
+                    <a:prstGeom prst="rect">
+                      <a:avLst/>
+                    </a:prstGeom>
+                    <a:ln>
+                      <a:noFill/>
+                    </a:ln>
+                    <a:extLst>
+                      <a:ext uri="{53640926-AAD7-44D8-BBD7-CCE9431645EC}">
+                        <a14:shadowObscured xmlns:a14="http://schemas.microsoft.com/office/drawing/2010/main"/>
+                      </a:ext>
+                    </a:extLst>
+                  </pic:spPr>
+                </pic:pic>
+              </a:graphicData>
+            </a:graphic>
+          </wp:inline>
+        </w:drawing>
+      </w:r>
+    </w:p>
+    <w:p>
+      <w:pPr>
+        <w:pStyle w:val="Listenabsatz"/>
+        <w:numPr>
+          <w:ilvl w:val="0"/>
+          <w:numId w:val="2"/>
+        </w:numPr>
+      </w:pPr>
+      <w:r>
         <w:br/>
       </w:r>
     </w:p>
@@ -152,6 +285,95 @@
 <file path=word/numbering.xml><?xml version="1.0" encoding="utf-8"?>
 <w:numbering xmlns:wpc="http://schemas.microsoft.com/office/word/2010/wordprocessingCanvas" xmlns:cx="http://schemas.microsoft.com/office/drawing/2014/chartex" xmlns:cx1="http://schemas.microsoft.com/office/drawing/2015/9/8/chartex" xmlns:cx2="http://schemas.microsoft.com/office/drawing/2015/10/21/chartex" xmlns:cx3="http://schemas.microsoft.com/office/drawing/2016/5/9/chartex" xmlns:cx4="http://schemas.microsoft.com/office/drawing/2016/5/10/chartex" xmlns:cx5="http://schemas.microsoft.com/office/drawing/2016/5/11/chartex" xmlns:cx6="http://schemas.microsoft.com/office/drawing/2016/5/12/chartex" xmlns:cx7="http://schemas.microsoft.com/office/drawing/2016/5/13/chartex" xmlns:cx8="http://schemas.microsoft.com/office/drawing/2016/5/14/chartex" xmlns:mc="http://schemas.openxmlformats.org/markup-compatibility/2006" xmlns:aink="http://schemas.microsoft.com/office/drawing/2016/ink" xmlns:am3d="http://schemas.microsoft.com/office/drawing/2017/model3d" xmlns:o="urn:schemas-microsoft-com:office:office" xmlns:r="http://schemas.openxmlformats.org/officeDocument/2006/relationships" xmlns:m="http://schemas.openxmlformats.org/officeDocument/2006/math" xmlns:v="urn:schemas-microsoft-com:vml" xmlns:wp14="http://schemas.microsoft.com/office/word/2010/wordprocessingDrawing" xmlns:wp="http://schemas.openxmlformats.org/drawingml/2006/wordprocessingDrawing" xmlns:w10="urn:schemas-microsoft-com:office:word" xmlns:w="http://schemas.openxmlformats.org/wordprocessingml/2006/main" xmlns:w14="http://schemas.microsoft.com/office/word/2010/wordml" xmlns:w15="http://schemas.microsoft.com/office/word/2012/wordml" xmlns:w16cex="http://schemas.microsoft.com/office/word/2018/wordml/cex" xmlns:w16cid="http://schemas.microsoft.com/office/word/2016/wordml/cid" xmlns:w16="http://schemas.microsoft.com/office/word/2018/wordml" xmlns:w16sdtdh="http://schemas.microsoft.com/office/word/2020/wordml/sdtdatahash" xmlns:w16se="http://schemas.microsoft.com/office/word/2015/wordml/symex" xmlns:wpg="http://schemas.microsoft.com/office/word/2010/wordprocessingGroup" xmlns:wpi="http://schemas.microsoft.com/office/word/2010/wordprocessingInk" xmlns:wne="http://schemas.microsoft.com/office/word/2006/wordml" xmlns:wps="http://schemas.microsoft.com/office/word/2010/wordprocessingShape" mc:Ignorable="w14 w15 w16se w16cid w16 w16cex w16sdtdh wp14">
   <w:abstractNum w:abstractNumId="0" w15:restartNumberingAfterBreak="0">
+    <w:nsid w:val="3BF724DA"/>
+    <w:multiLevelType w:val="hybridMultilevel"/>
+    <w:tmpl w:val="4B264E8E"/>
+    <w:lvl w:ilvl="0" w:tplc="0807000F">
+      <w:start w:val="1"/>
+      <w:numFmt w:val="decimal"/>
+      <w:lvlText w:val="%1."/>
+      <w:lvlJc w:val="left"/>
+      <w:pPr>
+        <w:ind w:left="720" w:hanging="360"/>
+      </w:pPr>
+      <w:rPr>
+        <w:rFonts w:hint="default"/>
+      </w:rPr>
+    </w:lvl>
+    <w:lvl w:ilvl="1" w:tplc="08070019" w:tentative="1">
+      <w:start w:val="1"/>
+      <w:numFmt w:val="lowerLetter"/>
+      <w:lvlText w:val="%2."/>
+      <w:lvlJc w:val="left"/>
+      <w:pPr>
+        <w:ind w:left="1440" w:hanging="360"/>
+      </w:pPr>
+    </w:lvl>
+    <w:lvl w:ilvl="2" w:tplc="0807001B" w:tentative="1">
+      <w:start w:val="1"/>
+      <w:numFmt w:val="lowerRoman"/>
+      <w:lvlText w:val="%3."/>
+      <w:lvlJc w:val="right"/>
+      <w:pPr>
+        <w:ind w:left="2160" w:hanging="180"/>
+      </w:pPr>
+    </w:lvl>
+    <w:lvl w:ilvl="3" w:tplc="0807000F" w:tentative="1">
+      <w:start w:val="1"/>
+      <w:numFmt w:val="decimal"/>
+      <w:lvlText w:val="%4."/>
+      <w:lvlJc w:val="left"/>
+      <w:pPr>
+        <w:ind w:left="2880" w:hanging="360"/>
+      </w:pPr>
+    </w:lvl>
+    <w:lvl w:ilvl="4" w:tplc="08070019" w:tentative="1">
+      <w:start w:val="1"/>
+      <w:numFmt w:val="lowerLetter"/>
+      <w:lvlText w:val="%5."/>
+      <w:lvlJc w:val="left"/>
+      <w:pPr>
+        <w:ind w:left="3600" w:hanging="360"/>
+      </w:pPr>
+    </w:lvl>
+    <w:lvl w:ilvl="5" w:tplc="0807001B" w:tentative="1">
+      <w:start w:val="1"/>
+      <w:numFmt w:val="lowerRoman"/>
+      <w:lvlText w:val="%6."/>
+      <w:lvlJc w:val="right"/>
+      <w:pPr>
+        <w:ind w:left="4320" w:hanging="180"/>
+      </w:pPr>
+    </w:lvl>
+    <w:lvl w:ilvl="6" w:tplc="0807000F" w:tentative="1">
+      <w:start w:val="1"/>
+      <w:numFmt w:val="decimal"/>
+      <w:lvlText w:val="%7."/>
+      <w:lvlJc w:val="left"/>
+      <w:pPr>
+        <w:ind w:left="5040" w:hanging="360"/>
+      </w:pPr>
+    </w:lvl>
+    <w:lvl w:ilvl="7" w:tplc="08070019" w:tentative="1">
+      <w:start w:val="1"/>
+      <w:numFmt w:val="lowerLetter"/>
+      <w:lvlText w:val="%8."/>
+      <w:lvlJc w:val="left"/>
+      <w:pPr>
+        <w:ind w:left="5760" w:hanging="360"/>
+      </w:pPr>
+    </w:lvl>
+    <w:lvl w:ilvl="8" w:tplc="0807001B" w:tentative="1">
+      <w:start w:val="1"/>
+      <w:numFmt w:val="lowerRoman"/>
+      <w:lvlText w:val="%9."/>
+      <w:lvlJc w:val="right"/>
+      <w:pPr>
+        <w:ind w:left="6480" w:hanging="180"/>
+      </w:pPr>
+    </w:lvl>
+  </w:abstractNum>
+  <w:abstractNum w:abstractNumId="1" w15:restartNumberingAfterBreak="0">
     <w:nsid w:val="4DF31D45"/>
     <w:multiLevelType w:val="hybridMultilevel"/>
     <w:tmpl w:val="AA0407A4"/>
@@ -241,6 +463,9 @@
     </w:lvl>
   </w:abstractNum>
   <w:num w:numId="1">
+    <w:abstractNumId w:val="1"/>
+  </w:num>
+  <w:num w:numId="2">
     <w:abstractNumId w:val="0"/>
   </w:num>
 </w:numbering>
@@ -645,6 +870,27 @@
     <w:name w:val="Normal"/>
     <w:qFormat/>
   </w:style>
+  <w:style w:type="paragraph" w:styleId="berschrift1">
+    <w:name w:val="heading 1"/>
+    <w:basedOn w:val="Standard"/>
+    <w:next w:val="Standard"/>
+    <w:link w:val="berschrift1Zchn"/>
+    <w:uiPriority w:val="9"/>
+    <w:qFormat/>
+    <w:rsid w:val="00DC1015"/>
+    <w:pPr>
+      <w:keepNext/>
+      <w:keepLines/>
+      <w:spacing w:before="240" w:after="0"/>
+      <w:outlineLvl w:val="0"/>
+    </w:pPr>
+    <w:rPr>
+      <w:rFonts w:asciiTheme="majorHAnsi" w:eastAsiaTheme="majorEastAsia" w:hAnsiTheme="majorHAnsi" w:cstheme="majorBidi"/>
+      <w:color w:val="2F5496" w:themeColor="accent1" w:themeShade="BF"/>
+      <w:sz w:val="32"/>
+      <w:szCs w:val="32"/>
+    </w:rPr>
+  </w:style>
   <w:style w:type="character" w:default="1" w:styleId="Absatz-Standardschriftart">
     <w:name w:val="Default Paragraph Font"/>
     <w:uiPriority w:val="1"/>
@@ -727,6 +973,19 @@
     <w:rPr>
       <w:color w:val="0000FF"/>
       <w:u w:val="single"/>
+    </w:rPr>
+  </w:style>
+  <w:style w:type="character" w:customStyle="1" w:styleId="berschrift1Zchn">
+    <w:name w:val="Überschrift 1 Zchn"/>
+    <w:basedOn w:val="Absatz-Standardschriftart"/>
+    <w:link w:val="berschrift1"/>
+    <w:uiPriority w:val="9"/>
+    <w:rsid w:val="00DC1015"/>
+    <w:rPr>
+      <w:rFonts w:asciiTheme="majorHAnsi" w:eastAsiaTheme="majorEastAsia" w:hAnsiTheme="majorHAnsi" w:cstheme="majorBidi"/>
+      <w:color w:val="2F5496" w:themeColor="accent1" w:themeShade="BF"/>
+      <w:sz w:val="32"/>
+      <w:szCs w:val="32"/>
     </w:rPr>
   </w:style>
 </w:styles>

</xml_diff>